<commit_message>
Trim document set to 25 files (ChatGPT Plus project limit)
Removed 5 files no question uses, merged D06 into D24 and Q1/Q2 sales into one workbook.
Questions and expected answers unchanged; source IDs updated.

Co-Authored-By: Claude Opus 5 (1M context) <noreply@anthropic.com>
Claude-Session: https://claude.ai/code/session_01RWsUiV4sLpqJtDDTbZ6UHZ
</commit_message>
<xml_diff>
--- a/documents/Shipping FAQ (website copy).docx
+++ b/documents/Shipping FAQ (website copy).docx
@@ -47,6 +47,58 @@
     <w:p>
       <w:r>
         <w:t>Yes, on qualifying US orders. See checkout for details.</w:t>
+      </w:r>
+    </w:p>
+    <w:p>
+      <w:pPr>
+        <w:pStyle w:val="Heading2"/>
+      </w:pPr>
+      <w:r>
+        <w:t>Where do you ship?</w:t>
+      </w:r>
+    </w:p>
+    <w:p>
+      <w:r>
+        <w:t>We ship within the United States and to Canada. We do not ship to other countries at this time.</w:t>
+      </w:r>
+    </w:p>
+    <w:p>
+      <w:pPr>
+        <w:pStyle w:val="Heading2"/>
+      </w:pPr>
+      <w:r>
+        <w:t>How long does shipping to Canada take?</w:t>
+      </w:r>
+    </w:p>
+    <w:p>
+      <w:r>
+        <w:t>Usually 7-14 business days after the order ships.</w:t>
+      </w:r>
+    </w:p>
+    <w:p>
+      <w:pPr>
+        <w:pStyle w:val="Heading2"/>
+      </w:pPr>
+      <w:r>
+        <w:t>Who pays duties and taxes?</w:t>
+      </w:r>
+    </w:p>
+    <w:p>
+      <w:r>
+        <w:t>The customer pays any duties, taxes and brokerage fees on delivery.</w:t>
+      </w:r>
+    </w:p>
+    <w:p>
+      <w:pPr>
+        <w:pStyle w:val="Heading2"/>
+      </w:pPr>
+      <w:r>
+        <w:t>Can I return an international order?</w:t>
+      </w:r>
+    </w:p>
+    <w:p>
+      <w:r>
+        <w:t>Yes, under our standard return policy. International customers pay return shipping.</w:t>
       </w:r>
     </w:p>
     <w:sectPr>

</xml_diff>